<commit_message>
fix(vue): restore popup keyboard focus
Arm table, editing-mode, overflow, and hyperlink focus after their panels mount, including asChild ref forwarding.

Co-authored-by: Cursor <cursoragent@cursor.com>
</commit_message>
<xml_diff>
--- a/e2e/fixtures/hyperlink-demo.docx
+++ b/e2e/fixtures/hyperlink-demo.docx
@@ -16,6 +16,24 @@
         </w:r>
       </w:hyperlink>
     </w:p>
+    <w:tbl>
+      <w:tblPr/>
+      <w:tblGrid>
+        <w:gridCol w:w="4320"/>
+      </w:tblGrid>
+      <w:tr>
+        <w:tc>
+          <w:tcPr>
+            <w:tcW w:w="4320" w:type="dxa"/>
+          </w:tcPr>
+          <w:p>
+            <w:r>
+              <w:t>Table cell</w:t>
+            </w:r>
+          </w:p>
+        </w:tc>
+      </w:tr>
+    </w:tbl>
   </w:body>
 </w:document>
 </file>
</xml_diff>